<commit_message>
S2.3 Dinosaur Poster: fix rebuild audit findings A1-A3, N4
New project blocks set at 8pt or larger; footer page-number field now carries
the footer's size and colour (shared fix, verified pixel-identical above the
footer across existing worksheet and notes builds); worksheet README
documents the new blocks.

Co-Authored-By: Claude Opus 5.5 <noreply@anthropic.com>
Claude-Session: https://claude.ai/code/session_01HWTQzGZRAKCmdcWm3fg7R2
</commit_message>
<xml_diff>
--- a/output/geology/u02/2.3 Activity - Dinosaur Poster.docx
+++ b/output/geology/u02/2.3 Activity - Dinosaur Poster.docx
@@ -425,7 +425,7 @@
                       <w:b/>
                       <w:i w:val="0"/>
                       <w:color w:val="0E766A"/>
-                      <w:sz w:val="15"/>
+                      <w:sz w:val="16"/>
                       <w:spacing w:val="26"/>
                     </w:rPr>
                     <w:t>NAME HEADER</w:t>
@@ -435,6 +435,7 @@
                       <w:rFonts w:ascii="Trade Gothic Next" w:hAnsi="Trade Gothic Next"/>
                       <w:b w:val="0"/>
                       <w:i w:val="0"/>
+                      <w:color w:val="55604F"/>
                       <w:sz w:val="16"/>
                     </w:rPr>
                     <w:t xml:space="preserve">   </w:t>
@@ -502,7 +503,7 @@
                       <w:b/>
                       <w:i w:val="0"/>
                       <w:color w:val="0E766A"/>
-                      <w:sz w:val="15"/>
+                      <w:sz w:val="16"/>
                       <w:spacing w:val="26"/>
                     </w:rPr>
                     <w:t>MESOZOIC TIMELINE</w:t>
@@ -512,6 +513,7 @@
                       <w:rFonts w:ascii="Trade Gothic Next" w:hAnsi="Trade Gothic Next"/>
                       <w:b w:val="0"/>
                       <w:i w:val="0"/>
+                      <w:color w:val="55604F"/>
                       <w:sz w:val="16"/>
                     </w:rPr>
                     <w:t xml:space="preserve">   </w:t>
@@ -728,7 +730,7 @@
                       <w:b/>
                       <w:i w:val="0"/>
                       <w:color w:val="14161B"/>
-                      <w:sz w:val="15"/>
+                      <w:sz w:val="16"/>
                       <w:spacing w:val="26"/>
                     </w:rPr>
                     <w:t>DRAWING</w:t>
@@ -782,7 +784,7 @@
                       <w:b/>
                       <w:i w:val="0"/>
                       <w:color w:val="0E766A"/>
-                      <w:sz w:val="15"/>
+                      <w:sz w:val="16"/>
                       <w:spacing w:val="26"/>
                     </w:rPr>
                     <w:t>ABOUT MY DINOSAUR</w:t>
@@ -836,7 +838,7 @@
                       <w:b/>
                       <w:i w:val="0"/>
                       <w:color w:val="14161B"/>
-                      <w:sz w:val="15"/>
+                      <w:sz w:val="16"/>
                       <w:spacing w:val="26"/>
                     </w:rPr>
                     <w:t>MAP OF EARTH BACK THEN</w:t>
@@ -859,7 +861,7 @@
                 </w:p>
                 <w:p>
                   <w:pPr>
-                    <w:spacing w:before="1597"/>
+                    <w:spacing w:before="1584"/>
                     <w:jc w:val="right"/>
                   </w:pPr>
                   <w:r>
@@ -1062,12 +1064,12 @@
     </w:tbl>
     <w:p>
       <w:pPr>
-        <w:spacing w:before="0" w:after="0" w:line="80" w:lineRule="exact"/>
+        <w:spacing w:before="0" w:after="0" w:line="180" w:lineRule="exact"/>
       </w:pPr>
       <w:r>
         <w:rPr>
           <w:rFonts w:ascii="Trade Gothic Next" w:hAnsi="Trade Gothic Next"/>
-          <w:sz w:val="4"/>
+          <w:sz w:val="14"/>
         </w:rPr>
       </w:r>
     </w:p>
@@ -1476,7 +1478,7 @@
                       <w:rFonts w:ascii="Trade Gothic Next" w:hAnsi="Trade Gothic Next"/>
                       <w:b/>
                       <w:color w:val="55604F"/>
-                      <w:sz w:val="14"/>
+                      <w:sz w:val="16"/>
                       <w:spacing w:val="26"/>
                     </w:rPr>
                     <w:t>FACT</w:t>
@@ -1505,7 +1507,7 @@
                       <w:rFonts w:ascii="Trade Gothic Next" w:hAnsi="Trade Gothic Next"/>
                       <w:b/>
                       <w:color w:val="55604F"/>
-                      <w:sz w:val="14"/>
+                      <w:sz w:val="16"/>
                       <w:spacing w:val="26"/>
                     </w:rPr>
                     <w:t>WHAT TO PUT</w:t>
@@ -3232,7 +3234,7 @@
                       <w:rFonts w:ascii="Trade Gothic Next" w:hAnsi="Trade Gothic Next"/>
                       <w:b/>
                       <w:color w:val="55604F"/>
-                      <w:sz w:val="14"/>
+                      <w:sz w:val="16"/>
                       <w:spacing w:val="26"/>
                     </w:rPr>
                     <w:t>PART</w:t>
@@ -3261,7 +3263,7 @@
                       <w:rFonts w:ascii="Trade Gothic Next" w:hAnsi="Trade Gothic Next"/>
                       <w:b/>
                       <w:color w:val="55604F"/>
-                      <w:sz w:val="14"/>
+                      <w:sz w:val="16"/>
                       <w:spacing w:val="26"/>
                     </w:rPr>
                     <w:t>FULL CREDIT</w:t>
@@ -3290,7 +3292,7 @@
                       <w:rFonts w:ascii="Trade Gothic Next" w:hAnsi="Trade Gothic Next"/>
                       <w:b/>
                       <w:color w:val="55604F"/>
-                      <w:sz w:val="14"/>
+                      <w:sz w:val="16"/>
                       <w:spacing w:val="26"/>
                     </w:rPr>
                     <w:t>PARTIAL</w:t>
@@ -3319,7 +3321,7 @@
                       <w:rFonts w:ascii="Trade Gothic Next" w:hAnsi="Trade Gothic Next"/>
                       <w:b/>
                       <w:color w:val="55604F"/>
-                      <w:sz w:val="14"/>
+                      <w:sz w:val="16"/>
                       <w:spacing w:val="26"/>
                     </w:rPr>
                     <w:t>LITTLE OR NONE</w:t>
@@ -3348,7 +3350,7 @@
                       <w:rFonts w:ascii="Trade Gothic Next" w:hAnsi="Trade Gothic Next"/>
                       <w:b/>
                       <w:color w:val="55604F"/>
-                      <w:sz w:val="14"/>
+                      <w:sz w:val="16"/>
                       <w:spacing w:val="26"/>
                     </w:rPr>
                     <w:t>SCORE</w:t>
@@ -4606,16 +4608,6 @@
         <w:sz w:val="14"/>
       </w:rPr>
       <w:fldChar w:fldCharType="begin"/>
-      <w:instrText xml:space="preserve"> PAGE </w:instrText>
-      <w:fldChar w:fldCharType="end"/>
-    </w:r>
-    <w:r>
-      <w:rPr>
-        <w:rFonts w:ascii="Trade Gothic Next" w:hAnsi="Trade Gothic Next"/>
-        <w:color w:val="61675B"/>
-        <w:sz w:val="14"/>
-      </w:rPr>
-      <w:t xml:space="preserve"> OF </w:t>
     </w:r>
     <w:r>
       <w:rPr>
@@ -4624,8 +4616,86 @@
         <w:color w:val="61675B"/>
         <w:sz w:val="14"/>
       </w:rPr>
+      <w:instrText xml:space="preserve"> PAGE </w:instrText>
+    </w:r>
+    <w:r>
+      <w:rPr>
+        <w:rFonts w:ascii="Trade Gothic Next" w:hAnsi="Trade Gothic Next"/>
+        <w:b w:val="0"/>
+        <w:color w:val="61675B"/>
+        <w:sz w:val="14"/>
+      </w:rPr>
+      <w:fldChar w:fldCharType="separate"/>
+    </w:r>
+    <w:r>
+      <w:rPr>
+        <w:rFonts w:ascii="Trade Gothic Next" w:hAnsi="Trade Gothic Next"/>
+        <w:b w:val="0"/>
+        <w:color w:val="61675B"/>
+        <w:sz w:val="14"/>
+      </w:rPr>
+      <w:t>1</w:t>
+    </w:r>
+    <w:r>
+      <w:rPr>
+        <w:rFonts w:ascii="Trade Gothic Next" w:hAnsi="Trade Gothic Next"/>
+        <w:b w:val="0"/>
+        <w:color w:val="61675B"/>
+        <w:sz w:val="14"/>
+      </w:rPr>
+      <w:fldChar w:fldCharType="end"/>
+    </w:r>
+    <w:r>
+      <w:rPr>
+        <w:rFonts w:ascii="Trade Gothic Next" w:hAnsi="Trade Gothic Next"/>
+        <w:color w:val="61675B"/>
+        <w:sz w:val="14"/>
+      </w:rPr>
+      <w:t xml:space="preserve"> OF </w:t>
+    </w:r>
+    <w:r>
+      <w:rPr>
+        <w:rFonts w:ascii="Trade Gothic Next" w:hAnsi="Trade Gothic Next"/>
+        <w:b w:val="0"/>
+        <w:color w:val="61675B"/>
+        <w:sz w:val="14"/>
+      </w:rPr>
       <w:fldChar w:fldCharType="begin"/>
+    </w:r>
+    <w:r>
+      <w:rPr>
+        <w:rFonts w:ascii="Trade Gothic Next" w:hAnsi="Trade Gothic Next"/>
+        <w:b w:val="0"/>
+        <w:color w:val="61675B"/>
+        <w:sz w:val="14"/>
+      </w:rPr>
       <w:instrText xml:space="preserve"> NUMPAGES </w:instrText>
+    </w:r>
+    <w:r>
+      <w:rPr>
+        <w:rFonts w:ascii="Trade Gothic Next" w:hAnsi="Trade Gothic Next"/>
+        <w:b w:val="0"/>
+        <w:color w:val="61675B"/>
+        <w:sz w:val="14"/>
+      </w:rPr>
+      <w:fldChar w:fldCharType="separate"/>
+    </w:r>
+    <w:r>
+      <w:rPr>
+        <w:rFonts w:ascii="Trade Gothic Next" w:hAnsi="Trade Gothic Next"/>
+        <w:b w:val="0"/>
+        <w:color w:val="61675B"/>
+        <w:sz w:val="14"/>
+      </w:rPr>
+      <w:t>1</w:t>
+    </w:r>
+    <w:r>
+      <w:rPr>
+        <w:rFonts w:ascii="Trade Gothic Next" w:hAnsi="Trade Gothic Next"/>
+        <w:b w:val="0"/>
+        <w:color w:val="61675B"/>
+        <w:sz w:val="14"/>
+      </w:rPr>
       <w:fldChar w:fldCharType="end"/>
     </w:r>
   </w:p>

</xml_diff>